<commit_message>
Format DOCX conforme aux normes Décisions Marketing (style des titres)
Post-traitement code/12_format_dm_docx.py : conversion de tout le
document en style « Normal » (suppression des styles de titre prédéfinis
de Word, non conformes), avec présentation manuelle des titres — Titre 1
en Times New Roman 14 gras, sous-titres en TNR 12 italique —, corps en
TNR 12, interligne 1,5, justifié.

La checklist signale désormais le dépassement de la limite de 20 pages
(~22 pages estimées), à traiter par des coupes.

Co-Authored-By: Claude Opus 4.8 <noreply@anthropic.com>
Claude-Session: https://claude.ai/code/session_01GPMhaLyMn13E1D3y8GrY2W
</commit_message>
<xml_diff>
--- a/outputs/soumission_DM/0_checklist_conformite_DM.docx
+++ b/outputs/soumission_DM/0_checklist_conformite_DM.docx
@@ -438,7 +438,7 @@
               <w:pStyle w:val="Compact"/>
             </w:pPr>
             <w:r>
-              <w:t xml:space="preserve">Longueur</w:t>
+              <w:t xml:space="preserve">Longueur (mots)</w:t>
             </w:r>
           </w:p>
         </w:tc>
@@ -460,7 +460,7 @@
               <w:pStyle w:val="Compact"/>
             </w:pPr>
             <w:r>
-              <w:t xml:space="preserve">7 980 mots</w:t>
+              <w:t xml:space="preserve">7 986 mots</w:t>
             </w:r>
           </w:p>
         </w:tc>
@@ -473,6 +473,53 @@
             </w:pPr>
             <w:r>
               <w:t xml:space="preserve">✅</w:t>
+            </w:r>
+          </w:p>
+        </w:tc>
+      </w:tr>
+      <w:tr>
+        <w:tc>
+          <w:tcPr/>
+          <w:p>
+            <w:pPr>
+              <w:pStyle w:val="Compact"/>
+            </w:pPr>
+            <w:r>
+              <w:t xml:space="preserve">Longueur (pages)</w:t>
+            </w:r>
+          </w:p>
+        </w:tc>
+        <w:tc>
+          <w:tcPr/>
+          <w:p>
+            <w:pPr>
+              <w:pStyle w:val="Compact"/>
+            </w:pPr>
+            <w:r>
+              <w:t xml:space="preserve">≤ 20 pages (hors page de titre + résumés)</w:t>
+            </w:r>
+          </w:p>
+        </w:tc>
+        <w:tc>
+          <w:tcPr/>
+          <w:p>
+            <w:pPr>
+              <w:pStyle w:val="Compact"/>
+            </w:pPr>
+            <w:r>
+              <w:t xml:space="preserve">~22 p. estimées</w:t>
+            </w:r>
+          </w:p>
+        </w:tc>
+        <w:tc>
+          <w:tcPr/>
+          <w:p>
+            <w:pPr>
+              <w:pStyle w:val="Compact"/>
+              <w:jc w:val="center"/>
+            </w:pPr>
+            <w:r>
+              <w:t xml:space="preserve">⚠️ à réduire</w:t>
             </w:r>
           </w:p>
         </w:tc>
@@ -699,7 +746,20 @@
               <w:pStyle w:val="Compact"/>
             </w:pPr>
             <w:r>
-              <w:t xml:space="preserve">Thématiques (non « Introduction / Méthode… »)</w:t>
+              <w:t xml:space="preserve">Thématiques ;</w:t>
+            </w:r>
+            <w:r>
+              <w:t xml:space="preserve"> </w:t>
+            </w:r>
+            <w:r>
+              <w:rPr>
+                <w:b/>
+                <w:bCs/>
+              </w:rPr>
+              <w:t xml:space="preserve">style Normal</w:t>
+            </w:r>
+            <w:r>
+              <w:t xml:space="preserve">, Titre 1 = TNR 14 gras, Sous-titre = TNR 12 italique (pas de styles Word)</w:t>
             </w:r>
           </w:p>
         </w:tc>
@@ -710,7 +770,19 @@
               <w:pStyle w:val="Compact"/>
             </w:pPr>
             <w:r>
-              <w:t xml:space="preserve">thématiques</w:t>
+              <w:t xml:space="preserve">appliqué (post-traitement</w:t>
+            </w:r>
+            <w:r>
+              <w:t xml:space="preserve"> </w:t>
+            </w:r>
+            <w:r>
+              <w:rPr>
+                <w:rStyle w:val="VerbatimChar"/>
+              </w:rPr>
+              <w:t xml:space="preserve">code/12</w:t>
+            </w:r>
+            <w:r>
+              <w:t xml:space="preserve">)</w:t>
             </w:r>
           </w:p>
         </w:tc>

</xml_diff>

<commit_message>
Conformité format DM : coupes pour la limite de 20 pages
Coupes validées par l'autrice pour respecter la limite de 20 pages :
- Encadré 3 supprimé (répétait mot pour mot les 4 recommandations).
- Figure 'plan factoriel' (ACM) supprimée (silhouette 0,24, illisible en
  N&B ; typologie déjà dans le tableau des stratégies).
- Figure 'motivations' + son paragraphe supprimés ; la mention du prix
  secondaire est réancrée sur Feldmann et Hamm (2015).
Figures renumérotées (régression -> Figure 4). Léger resserrement de la
section managériale.

Résultat : 4 figures (au lieu de 6), 2 encadrés (au lieu de 3), 7 710
mots ; estimation ~19-20 pages. Audit de traçabilite realigné (retrait
des contrôles de motivations) : 119/119.

Co-Authored-By: Claude Opus 4.8 <noreply@anthropic.com>
Claude-Session: https://claude.ai/code/session_01GPMhaLyMn13E1D3y8GrY2W
</commit_message>
<xml_diff>
--- a/outputs/soumission_DM/0_checklist_conformite_DM.docx
+++ b/outputs/soumission_DM/0_checklist_conformite_DM.docx
@@ -460,7 +460,7 @@
               <w:pStyle w:val="Compact"/>
             </w:pPr>
             <w:r>
-              <w:t xml:space="preserve">7 986 mots</w:t>
+              <w:t xml:space="preserve">7 710 mots</w:t>
             </w:r>
           </w:p>
         </w:tc>
@@ -507,7 +507,7 @@
               <w:pStyle w:val="Compact"/>
             </w:pPr>
             <w:r>
-              <w:t xml:space="preserve">~22 p. estimées</w:t>
+              <w:t xml:space="preserve">~19-20 p. estimées</w:t>
             </w:r>
           </w:p>
         </w:tc>
@@ -519,7 +519,7 @@
               <w:jc w:val="center"/>
             </w:pPr>
             <w:r>
-              <w:t xml:space="preserve">⚠️ à réduire</w:t>
+              <w:t xml:space="preserve">✅ (coupe Enc. 3 + Fig. plan factoriel + Fig. motivations)</w:t>
             </w:r>
           </w:p>
         </w:tc>
@@ -829,7 +829,7 @@
               <w:pStyle w:val="Compact"/>
             </w:pPr>
             <w:r>
-              <w:t xml:space="preserve">3 encadrés (dispositif, typologie, recommandations)</w:t>
+              <w:t xml:space="preserve">2 encadrés (dispositif, typologie)</w:t>
             </w:r>
           </w:p>
         </w:tc>
@@ -923,7 +923,7 @@
               <w:pStyle w:val="Compact"/>
             </w:pPr>
             <w:r>
-              <w:t xml:space="preserve">6 figures N&amp;B</w:t>
+              <w:t xml:space="preserve">4 figures N&amp;B</w:t>
             </w:r>
           </w:p>
         </w:tc>

</xml_diff>

<commit_message>
Approfondissement du cadre cross-shopping / portefeuille de canaux
Ancrage renforcé de la revue de littérature sur le patronage de points
de vente, avec paiement dans les résultats :
- Structure hiérarchique du portefeuille : coûts fixes de la course ->
  magasin primaire, canaux secondaires au-delà d'un seuil de panier
  (Bell, Ho et Tang, 1998).
- Logique des types de courses : grosses courses vs courses d'appoint
  (Kahn et Schmittlein, 1989) ; la vente directe relève de l'appoint.
- Le 'noyau/périphérie' des résultats est nommé magasin primaire /
  canaux secondaires d'appoint.
Le fil attitude-comportement est conservé et resserré en compensation
(budget de mots). Deux références ajoutées, toutes deux vérifiées.

Vérification : 0 référence orpheline, 31 références (<= 35), 7 967 mots,
traçabilité 119/119.

Co-Authored-By: Claude Opus 4.8 <noreply@anthropic.com>
Claude-Session: https://claude.ai/code/session_01GPMhaLyMn13E1D3y8GrY2W
</commit_message>
<xml_diff>
--- a/outputs/soumission_DM/0_checklist_conformite_DM.docx
+++ b/outputs/soumission_DM/0_checklist_conformite_DM.docx
@@ -460,7 +460,7 @@
               <w:pStyle w:val="Compact"/>
             </w:pPr>
             <w:r>
-              <w:t xml:space="preserve">7 890 mots</w:t>
+              <w:t xml:space="preserve">7 967 mots</w:t>
             </w:r>
           </w:p>
         </w:tc>
@@ -554,7 +554,7 @@
               <w:pStyle w:val="Compact"/>
             </w:pPr>
             <w:r>
-              <w:t xml:space="preserve">29</w:t>
+              <w:t xml:space="preserve">31</w:t>
             </w:r>
           </w:p>
         </w:tc>

</xml_diff>

<commit_message>
Résumé : un seul paragraphe continu de 246 mots (<= 250)
Reformatage du résumé français : passage des cinq blocs structurés
(Objectifs / Méthodologie / Résultats / Implications / Originalité) à un
paragraphe unique et continu de 246 mots, couvrant les mêmes catégories
sans les afficher en sous-titres. Substance préservée. Checklist et
paquet mis à jour ; manuscrit à 7 923 mots.

Co-Authored-By: Claude Opus 4.8 <noreply@anthropic.com>
Claude-Session: https://claude.ai/code/session_01GPMhaLyMn13E1D3y8GrY2W
</commit_message>
<xml_diff>
--- a/outputs/soumission_DM/0_checklist_conformite_DM.docx
+++ b/outputs/soumission_DM/0_checklist_conformite_DM.docx
@@ -460,7 +460,7 @@
               <w:pStyle w:val="Compact"/>
             </w:pPr>
             <w:r>
-              <w:t xml:space="preserve">7 999 mots</w:t>
+              <w:t xml:space="preserve">7 923 mots</w:t>
             </w:r>
           </w:p>
         </w:tc>
@@ -641,7 +641,7 @@
               <w:pStyle w:val="Compact"/>
             </w:pPr>
             <w:r>
-              <w:t xml:space="preserve">Résumé structuré</w:t>
+              <w:t xml:space="preserve">Résumé</w:t>
             </w:r>
           </w:p>
         </w:tc>
@@ -652,7 +652,7 @@
               <w:pStyle w:val="Compact"/>
             </w:pPr>
             <w:r>
-              <w:t xml:space="preserve">Objectifs · Méthodologie · Résultats · Implications managériales · Originalité · Mots-clés</w:t>
+              <w:t xml:space="preserve">Un seul paragraphe ≤ 250 mots (objectif, méthode, résultats, implications, originalité)</w:t>
             </w:r>
           </w:p>
         </w:tc>
@@ -663,7 +663,7 @@
               <w:pStyle w:val="Compact"/>
             </w:pPr>
             <w:r>
-              <w:t xml:space="preserve">6 rubriques présentes</w:t>
+              <w:t xml:space="preserve">246 mots, un paragraphe</w:t>
             </w:r>
           </w:p>
         </w:tc>

</xml_diff>

<commit_message>
Résumé/abstract : version finale autrice + correction 'budget national'
Résumé français remplacé par la version retenue par l'autrice (un seul
paragraphe, 230 mots) : accroche enrichie, 'peu adoptée', et surtout
correction de l'imprécision — 1,5 % 'de leur budget alimentaire' (part
moyenne des ménages) au lieu de 'du budget alimentaire national'.
Abstract anglais traduit et aligné ('1.5% of their food budget on
average'), le corps du texte étant déjà correct sur ce point.

Co-Authored-By: Claude Opus 4.8 <noreply@anthropic.com>
Claude-Session: https://claude.ai/code/session_01GPMhaLyMn13E1D3y8GrY2W
</commit_message>
<xml_diff>
--- a/outputs/soumission_DM/0_checklist_conformite_DM.docx
+++ b/outputs/soumission_DM/0_checklist_conformite_DM.docx
@@ -460,7 +460,7 @@
               <w:pStyle w:val="Compact"/>
             </w:pPr>
             <w:r>
-              <w:t xml:space="preserve">7 923 mots</w:t>
+              <w:t xml:space="preserve">7 972 mots</w:t>
             </w:r>
           </w:p>
         </w:tc>
@@ -663,7 +663,7 @@
               <w:pStyle w:val="Compact"/>
             </w:pPr>
             <w:r>
-              <w:t xml:space="preserve">246 mots, un paragraphe</w:t>
+              <w:t xml:space="preserve">230 mots, un paragraphe</w:t>
             </w:r>
           </w:p>
         </w:tc>

</xml_diff>